<commit_message>
fix(docs): rewrite Задание to match exact дept blank, fit one page
Extracted the real blank text via olefile (UTF-16 WordDocument
stream). Corrected to match the кафедра ИСТ form exactly:
- profile 'Информационные технологии в цифровой экономике'
- зав. кафедрой к.ф.-м.н. (not к.п.н.)
- приказ № 354 от 13.04.2026, утв. 14.04.2026
- срок сдачи 1 июня 2026
- only 4 sections (no separate illustrative-material block)
Condensed initial data to one paragraph and the work items to
5 short points so the whole задание fits on a single page.
</commit_message>
<xml_diff>
--- a/docs/zadanie-vkr.docx
+++ b/docs/zadanie-vkr.docx
@@ -4,7 +4,37 @@
   <w:body>
     <w:p>
       <w:pPr>
-        <w:spacing w:after="80" w:before="0"/>
+        <w:spacing w:after="40" w:before="0" w:line="240" w:lineRule="auto"/>
+        <w:jc w:val="center"/>
+      </w:pPr>
+      <w:r>
+        <w:rPr>
+          <w:rFonts w:ascii="Times New Roman" w:hAnsi="Times New Roman" w:eastAsia="Times New Roman" w:cs="Times New Roman"/>
+          <w:b w:val="0"/>
+          <w:i w:val="0"/>
+          <w:sz w:val="22"/>
+        </w:rPr>
+        <w:t>Федеральное государственное бюджетное образовательное учреждение</w:t>
+      </w:r>
+    </w:p>
+    <w:p>
+      <w:pPr>
+        <w:spacing w:after="40" w:before="0" w:line="240" w:lineRule="auto"/>
+        <w:jc w:val="center"/>
+      </w:pPr>
+      <w:r>
+        <w:rPr>
+          <w:rFonts w:ascii="Times New Roman" w:hAnsi="Times New Roman" w:eastAsia="Times New Roman" w:cs="Times New Roman"/>
+          <w:b w:val="0"/>
+          <w:i w:val="0"/>
+          <w:sz w:val="22"/>
+        </w:rPr>
+        <w:t>высшего образования</w:t>
+      </w:r>
+    </w:p>
+    <w:p>
+      <w:pPr>
+        <w:spacing w:after="40" w:before="0" w:line="240" w:lineRule="auto"/>
         <w:jc w:val="center"/>
       </w:pPr>
       <w:r>
@@ -14,27 +44,12 @@
           <w:i w:val="0"/>
           <w:sz w:val="22"/>
         </w:rPr>
-        <w:t>МИНОБРНАУКИ РОССИИ</w:t>
+        <w:t>Ярославский государственный университет им. П.Г. Демидова</w:t>
       </w:r>
     </w:p>
     <w:p>
       <w:pPr>
-        <w:spacing w:after="80" w:before="0"/>
-        <w:jc w:val="center"/>
-      </w:pPr>
-      <w:r>
-        <w:rPr>
-          <w:rFonts w:ascii="Times New Roman" w:hAnsi="Times New Roman" w:eastAsia="Times New Roman" w:cs="Times New Roman"/>
-          <w:b w:val="0"/>
-          <w:i w:val="0"/>
-          <w:sz w:val="22"/>
-        </w:rPr>
-        <w:t>ФГБОУ ВО «Ярославский государственный университет им. П.Г. Демидова»</w:t>
-      </w:r>
-    </w:p>
-    <w:p>
-      <w:pPr>
-        <w:spacing w:after="360" w:before="0"/>
+        <w:spacing w:after="120" w:before="0" w:line="240" w:lineRule="auto"/>
         <w:jc w:val="center"/>
       </w:pPr>
       <w:r>
@@ -49,6 +64,37 @@
     </w:p>
     <w:p>
       <w:pPr>
+        <w:spacing w:after="40" w:before="0" w:line="240" w:lineRule="auto"/>
+        <w:jc w:val="center"/>
+      </w:pPr>
+      <w:r>
+        <w:rPr>
+          <w:rFonts w:ascii="Times New Roman" w:hAnsi="Times New Roman" w:eastAsia="Times New Roman" w:cs="Times New Roman"/>
+          <w:b w:val="0"/>
+          <w:i w:val="0"/>
+          <w:sz w:val="22"/>
+        </w:rPr>
+        <w:t>Направление подготовки 09.03.03 Прикладная информатика</w:t>
+      </w:r>
+    </w:p>
+    <w:p>
+      <w:pPr>
+        <w:spacing w:after="200" w:before="0" w:line="240" w:lineRule="auto"/>
+        <w:jc w:val="center"/>
+      </w:pPr>
+      <w:r>
+        <w:rPr>
+          <w:rFonts w:ascii="Times New Roman" w:hAnsi="Times New Roman" w:eastAsia="Times New Roman" w:cs="Times New Roman"/>
+          <w:b w:val="0"/>
+          <w:i w:val="0"/>
+          <w:sz w:val="22"/>
+        </w:rPr>
+        <w:t>Информационные технологии в цифровой экономике</w:t>
+      </w:r>
+    </w:p>
+    <w:p>
+      <w:pPr>
+        <w:spacing w:after="40" w:before="0" w:line="240" w:lineRule="auto"/>
         <w:jc w:val="right"/>
       </w:pPr>
       <w:r>
@@ -59,48 +105,12 @@
           <w:sz w:val="24"/>
         </w:rPr>
         <w:t>УТВЕРЖДАЮ</w:t>
-        <w:br/>
-        <w:t>Заведующий кафедрой</w:t>
-        <w:br/>
-        <w:t>______________ Чалый Дмитрий Юрьевич</w:t>
-        <w:br/>
-        <w:t>«___» __________ 2026 г.</w:t>
-      </w:r>
-    </w:p>
-    <w:p/>
-    <w:p>
-      <w:pPr>
-        <w:spacing w:after="40" w:before="0"/>
-        <w:jc w:val="center"/>
-      </w:pPr>
-      <w:r>
-        <w:rPr>
-          <w:rFonts w:ascii="Times New Roman" w:hAnsi="Times New Roman" w:eastAsia="Times New Roman" w:cs="Times New Roman"/>
-          <w:b/>
-          <w:i w:val="0"/>
-          <w:sz w:val="32"/>
-        </w:rPr>
-        <w:t>ЗАДАНИЕ</w:t>
       </w:r>
     </w:p>
     <w:p>
       <w:pPr>
-        <w:spacing w:after="360" w:before="0"/>
-        <w:jc w:val="center"/>
-      </w:pPr>
-      <w:r>
-        <w:rPr>
-          <w:rFonts w:ascii="Times New Roman" w:hAnsi="Times New Roman" w:eastAsia="Times New Roman" w:cs="Times New Roman"/>
-          <w:b/>
-          <w:i w:val="0"/>
-          <w:sz w:val="26"/>
-        </w:rPr>
-        <w:t>на выпускную квалификационную работу</w:t>
-      </w:r>
-    </w:p>
-    <w:p>
-      <w:pPr>
-        <w:spacing w:after="80"/>
+        <w:spacing w:after="40" w:before="0" w:line="240" w:lineRule="auto"/>
+        <w:jc w:val="right"/>
       </w:pPr>
       <w:r>
         <w:rPr>
@@ -109,21 +119,13 @@
           <w:i w:val="0"/>
           <w:sz w:val="24"/>
         </w:rPr>
-        <w:t xml:space="preserve">Студенту </w:t>
-      </w:r>
-      <w:r>
-        <w:rPr>
-          <w:rFonts w:ascii="Times New Roman" w:hAnsi="Times New Roman" w:eastAsia="Times New Roman" w:cs="Times New Roman"/>
-          <w:b/>
-          <w:i w:val="0"/>
-          <w:sz w:val="24"/>
-        </w:rPr>
-        <w:t>Журавлев Тарас Русланович, группа ПИЭ-41 БО</w:t>
+        <w:t>Зав. кафедрой, к.ф.-м.н.</w:t>
       </w:r>
     </w:p>
     <w:p>
       <w:pPr>
-        <w:spacing w:after="80"/>
+        <w:spacing w:after="40" w:before="0" w:line="240" w:lineRule="auto"/>
+        <w:jc w:val="right"/>
       </w:pPr>
       <w:r>
         <w:rPr>
@@ -132,8 +134,59 @@
           <w:i w:val="0"/>
           <w:sz w:val="24"/>
         </w:rPr>
-        <w:t xml:space="preserve">Направление подготовки: </w:t>
+        <w:t>_______________ Чалый Д.Ю.</w:t>
       </w:r>
+    </w:p>
+    <w:p>
+      <w:pPr>
+        <w:spacing w:after="240" w:before="0" w:line="240" w:lineRule="auto"/>
+        <w:jc w:val="right"/>
+      </w:pPr>
+      <w:r>
+        <w:rPr>
+          <w:rFonts w:ascii="Times New Roman" w:hAnsi="Times New Roman" w:eastAsia="Times New Roman" w:cs="Times New Roman"/>
+          <w:b w:val="0"/>
+          <w:i w:val="0"/>
+          <w:sz w:val="24"/>
+        </w:rPr>
+        <w:t>«14» апреля 2026 г.</w:t>
+      </w:r>
+    </w:p>
+    <w:p>
+      <w:pPr>
+        <w:spacing w:after="40" w:before="0" w:line="240" w:lineRule="auto"/>
+        <w:jc w:val="center"/>
+      </w:pPr>
+      <w:r>
+        <w:rPr>
+          <w:rFonts w:ascii="Times New Roman" w:hAnsi="Times New Roman" w:eastAsia="Times New Roman" w:cs="Times New Roman"/>
+          <w:b/>
+          <w:i w:val="0"/>
+          <w:sz w:val="28"/>
+        </w:rPr>
+        <w:t>ЗАДАНИЕ</w:t>
+      </w:r>
+    </w:p>
+    <w:p>
+      <w:pPr>
+        <w:spacing w:after="40" w:before="0" w:line="240" w:lineRule="auto"/>
+        <w:jc w:val="center"/>
+      </w:pPr>
+      <w:r>
+        <w:rPr>
+          <w:rFonts w:ascii="Times New Roman" w:hAnsi="Times New Roman" w:eastAsia="Times New Roman" w:cs="Times New Roman"/>
+          <w:b w:val="0"/>
+          <w:i w:val="0"/>
+          <w:sz w:val="24"/>
+        </w:rPr>
+        <w:t>по подготовке выпускной квалификационной работы студенту</w:t>
+      </w:r>
+    </w:p>
+    <w:p>
+      <w:pPr>
+        <w:spacing w:after="240" w:before="0" w:line="240" w:lineRule="auto"/>
+        <w:jc w:val="center"/>
+      </w:pPr>
       <w:r>
         <w:rPr>
           <w:rFonts w:ascii="Times New Roman" w:hAnsi="Times New Roman" w:eastAsia="Times New Roman" w:cs="Times New Roman"/>
@@ -141,13 +194,12 @@
           <w:i w:val="0"/>
           <w:sz w:val="24"/>
         </w:rPr>
-        <w:t>09.03.03 Прикладная информатика</w:t>
+        <w:t>Журавлев Тарас Русланович</w:t>
       </w:r>
     </w:p>
-    <w:p/>
     <w:p>
       <w:pPr>
-        <w:spacing w:after="40" w:before="0"/>
+        <w:spacing w:after="40" w:before="0" w:line="240" w:lineRule="auto"/>
         <w:jc w:val="left"/>
       </w:pPr>
       <w:r>
@@ -157,13 +209,13 @@
           <w:i w:val="0"/>
           <w:sz w:val="24"/>
         </w:rPr>
-        <w:t>1. Тема работы:</w:t>
+        <w:t>1. Тема работы</w:t>
       </w:r>
     </w:p>
     <w:p>
       <w:pPr>
-        <w:spacing w:after="80" w:before="0"/>
-        <w:jc w:val="left"/>
+        <w:spacing w:after="40" w:before="0" w:line="240" w:lineRule="auto"/>
+        <w:jc w:val="both"/>
       </w:pPr>
       <w:r>
         <w:rPr>
@@ -177,7 +229,7 @@
     </w:p>
     <w:p>
       <w:pPr>
-        <w:spacing w:after="200" w:before="0"/>
+        <w:spacing w:after="200" w:before="0" w:line="240" w:lineRule="auto"/>
         <w:jc w:val="left"/>
       </w:pPr>
       <w:r>
@@ -187,36 +239,12 @@
           <w:i/>
           <w:sz w:val="22"/>
         </w:rPr>
-        <w:t>утверждена приказом по университету от «___» __________ 2026 г.</w:t>
+        <w:t>Утверждена приказом № 354 от 13 апреля 2026 г.</w:t>
       </w:r>
     </w:p>
     <w:p>
       <w:pPr>
-        <w:spacing w:after="80"/>
-      </w:pPr>
-      <w:r>
-        <w:rPr>
-          <w:rFonts w:ascii="Times New Roman" w:hAnsi="Times New Roman" w:eastAsia="Times New Roman" w:cs="Times New Roman"/>
-          <w:b w:val="0"/>
-          <w:i w:val="0"/>
-          <w:sz w:val="24"/>
-        </w:rPr>
-        <w:t xml:space="preserve">2. Срок сдачи студентом законченной работы: </w:t>
-      </w:r>
-      <w:r>
-        <w:rPr>
-          <w:rFonts w:ascii="Times New Roman" w:hAnsi="Times New Roman" w:eastAsia="Times New Roman" w:cs="Times New Roman"/>
-          <w:b/>
-          <w:i w:val="0"/>
-          <w:sz w:val="24"/>
-        </w:rPr>
-        <w:t>26 мая 2026 г.</w:t>
-      </w:r>
-    </w:p>
-    <w:p/>
-    <w:p>
-      <w:pPr>
-        <w:spacing w:after="80" w:before="0"/>
+        <w:spacing w:after="200" w:before="0" w:line="240" w:lineRule="auto"/>
         <w:jc w:val="left"/>
       </w:pPr>
       <w:r>
@@ -226,13 +254,133 @@
           <w:i w:val="0"/>
           <w:sz w:val="24"/>
         </w:rPr>
-        <w:t>3. Исходные данные к работе:</w:t>
+        <w:t>2. Срок сдачи законченной работы: 1 июня 2026 г.</w:t>
       </w:r>
     </w:p>
     <w:p>
       <w:pPr>
-        <w:spacing w:after="60" w:before="0"/>
-        <w:ind w:left="283"/>
+        <w:spacing w:after="40" w:before="0" w:line="240" w:lineRule="auto"/>
+        <w:jc w:val="left"/>
+      </w:pPr>
+      <w:r>
+        <w:rPr>
+          <w:rFonts w:ascii="Times New Roman" w:hAnsi="Times New Roman" w:eastAsia="Times New Roman" w:cs="Times New Roman"/>
+          <w:b/>
+          <w:i w:val="0"/>
+          <w:sz w:val="24"/>
+        </w:rPr>
+        <w:t>3. Исходные данные к работе</w:t>
+      </w:r>
+    </w:p>
+    <w:p>
+      <w:pPr>
+        <w:spacing w:after="200" w:before="0" w:line="240" w:lineRule="auto"/>
+        <w:jc w:val="both"/>
+      </w:pPr>
+      <w:r>
+        <w:rPr>
+          <w:rFonts w:ascii="Times New Roman" w:hAnsi="Times New Roman" w:eastAsia="Times New Roman" w:cs="Times New Roman"/>
+          <w:b w:val="0"/>
+          <w:i w:val="0"/>
+          <w:sz w:val="24"/>
+        </w:rPr>
+        <w:t>Датасет фотографий, собранный через открытые API стоковых сервисов Unsplash и Pexels; предобученная свёрточная нейронная сеть EfficientNet-B0; программные средства: Python (PyTorch, FastAPI, scikit-learn), Java (Spring Boot), React; инфраструктура: PostgreSQL, MinIO, RabbitMQ, Docker.</w:t>
+      </w:r>
+    </w:p>
+    <w:p>
+      <w:pPr>
+        <w:spacing w:after="40" w:before="0" w:line="240" w:lineRule="auto"/>
+        <w:jc w:val="left"/>
+      </w:pPr>
+      <w:r>
+        <w:rPr>
+          <w:rFonts w:ascii="Times New Roman" w:hAnsi="Times New Roman" w:eastAsia="Times New Roman" w:cs="Times New Roman"/>
+          <w:b/>
+          <w:i w:val="0"/>
+          <w:sz w:val="24"/>
+        </w:rPr>
+        <w:t>4. Перечень подлежащих разработке вопросов:</w:t>
+      </w:r>
+    </w:p>
+    <w:p>
+      <w:pPr>
+        <w:spacing w:after="40" w:before="0" w:line="240" w:lineRule="auto"/>
+        <w:jc w:val="both"/>
+      </w:pPr>
+      <w:r>
+        <w:rPr>
+          <w:rFonts w:ascii="Times New Roman" w:hAnsi="Times New Roman" w:eastAsia="Times New Roman" w:cs="Times New Roman"/>
+          <w:b w:val="0"/>
+          <w:i w:val="0"/>
+          <w:sz w:val="24"/>
+        </w:rPr>
+        <w:t>1) обзор методов классификации изображений, обоснование выбора архитектуры нейронной сети;</w:t>
+      </w:r>
+    </w:p>
+    <w:p>
+      <w:pPr>
+        <w:spacing w:after="40" w:before="0" w:line="240" w:lineRule="auto"/>
+        <w:jc w:val="both"/>
+      </w:pPr>
+      <w:r>
+        <w:rPr>
+          <w:rFonts w:ascii="Times New Roman" w:hAnsi="Times New Roman" w:eastAsia="Times New Roman" w:cs="Times New Roman"/>
+          <w:b w:val="0"/>
+          <w:i w:val="0"/>
+          <w:sz w:val="24"/>
+        </w:rPr>
+        <w:t>2) сбор, разметка и предобработка датасета фотографий по стилевым категориям;</w:t>
+      </w:r>
+    </w:p>
+    <w:p>
+      <w:pPr>
+        <w:spacing w:after="40" w:before="0" w:line="240" w:lineRule="auto"/>
+        <w:jc w:val="both"/>
+      </w:pPr>
+      <w:r>
+        <w:rPr>
+          <w:rFonts w:ascii="Times New Roman" w:hAnsi="Times New Roman" w:eastAsia="Times New Roman" w:cs="Times New Roman"/>
+          <w:b w:val="0"/>
+          <w:i w:val="0"/>
+          <w:sz w:val="24"/>
+        </w:rPr>
+        <w:t>3) обучение модели классификации методом transfer learning, оценка качества;</w:t>
+      </w:r>
+    </w:p>
+    <w:p>
+      <w:pPr>
+        <w:spacing w:after="40" w:before="0" w:line="240" w:lineRule="auto"/>
+        <w:jc w:val="both"/>
+      </w:pPr>
+      <w:r>
+        <w:rPr>
+          <w:rFonts w:ascii="Times New Roman" w:hAnsi="Times New Roman" w:eastAsia="Times New Roman" w:cs="Times New Roman"/>
+          <w:b w:val="0"/>
+          <w:i w:val="0"/>
+          <w:sz w:val="24"/>
+        </w:rPr>
+        <w:t>4) проектирование и реализация микросервисной архитектуры (серверная часть, ML-сервис, веб-клиент);</w:t>
+      </w:r>
+    </w:p>
+    <w:p>
+      <w:pPr>
+        <w:spacing w:after="40" w:before="0" w:line="240" w:lineRule="auto"/>
+        <w:jc w:val="both"/>
+      </w:pPr>
+      <w:r>
+        <w:rPr>
+          <w:rFonts w:ascii="Times New Roman" w:hAnsi="Times New Roman" w:eastAsia="Times New Roman" w:cs="Times New Roman"/>
+          <w:b w:val="0"/>
+          <w:i w:val="0"/>
+          <w:sz w:val="24"/>
+        </w:rPr>
+        <w:t>5) проведение исследовательских экспериментов, развёртывание и тестирование системы.</w:t>
+      </w:r>
+    </w:p>
+    <w:p/>
+    <w:p>
+      <w:pPr>
+        <w:spacing w:after="200" w:before="0" w:line="240" w:lineRule="auto"/>
         <w:jc w:val="left"/>
       </w:pPr>
       <w:r>
@@ -242,13 +390,12 @@
           <w:i w:val="0"/>
           <w:sz w:val="24"/>
         </w:rPr>
-        <w:t>– набор фотографий, собираемый через открытые API стоковых сервисов Unsplash и Pexels;</w:t>
+        <w:t>Руководитель ВКР _______________ / Д.Ю. Чалый /</w:t>
       </w:r>
     </w:p>
     <w:p>
       <w:pPr>
-        <w:spacing w:after="60" w:before="0"/>
-        <w:ind w:left="283"/>
+        <w:spacing w:after="200" w:before="0" w:line="240" w:lineRule="auto"/>
         <w:jc w:val="left"/>
       </w:pPr>
       <w:r>
@@ -258,13 +405,12 @@
           <w:i w:val="0"/>
           <w:sz w:val="24"/>
         </w:rPr>
-        <w:t>– предобученная свёрточная нейронная сеть EfficientNet-B0 (библиотека torchvision);</w:t>
+        <w:t>Задание принял к исполнению _______________ / Т.Р. Журавлев /</w:t>
       </w:r>
     </w:p>
     <w:p>
       <w:pPr>
-        <w:spacing w:after="60" w:before="0"/>
-        <w:ind w:left="283"/>
+        <w:spacing w:after="40" w:before="0" w:line="240" w:lineRule="auto"/>
         <w:jc w:val="left"/>
       </w:pPr>
       <w:r>
@@ -274,323 +420,12 @@
           <w:i w:val="0"/>
           <w:sz w:val="24"/>
         </w:rPr>
-        <w:t>– программные средства: Python 3.11 (PyTorch, FastAPI, scikit-learn), Java 17 (Spring Boot), React (Vite);</w:t>
-      </w:r>
-    </w:p>
-    <w:p>
-      <w:pPr>
-        <w:spacing w:after="60" w:before="0"/>
-        <w:ind w:left="283"/>
-        <w:jc w:val="left"/>
-      </w:pPr>
-      <w:r>
-        <w:rPr>
-          <w:rFonts w:ascii="Times New Roman" w:hAnsi="Times New Roman" w:eastAsia="Times New Roman" w:cs="Times New Roman"/>
-          <w:b w:val="0"/>
-          <w:i w:val="0"/>
-          <w:sz w:val="24"/>
-        </w:rPr>
-        <w:t>– инфраструктурные компоненты: PostgreSQL, MinIO, RabbitMQ, Docker;</w:t>
-      </w:r>
-    </w:p>
-    <w:p>
-      <w:pPr>
-        <w:spacing w:after="60" w:before="0"/>
-        <w:ind w:left="283"/>
-        <w:jc w:val="left"/>
-      </w:pPr>
-      <w:r>
-        <w:rPr>
-          <w:rFonts w:ascii="Times New Roman" w:hAnsi="Times New Roman" w:eastAsia="Times New Roman" w:cs="Times New Roman"/>
-          <w:b w:val="0"/>
-          <w:i w:val="0"/>
-          <w:sz w:val="24"/>
-        </w:rPr>
-        <w:t>– научная литература по transfer learning и классификации изображений.</w:t>
-      </w:r>
-    </w:p>
-    <w:p/>
-    <w:p>
-      <w:pPr>
-        <w:spacing w:after="80" w:before="0"/>
-        <w:jc w:val="left"/>
-      </w:pPr>
-      <w:r>
-        <w:rPr>
-          <w:rFonts w:ascii="Times New Roman" w:hAnsi="Times New Roman" w:eastAsia="Times New Roman" w:cs="Times New Roman"/>
-          <w:b/>
-          <w:i w:val="0"/>
-          <w:sz w:val="24"/>
-        </w:rPr>
-        <w:t>4. Содержание работы (перечень подлежащих разработке вопросов):</w:t>
-      </w:r>
-    </w:p>
-    <w:p>
-      <w:pPr>
-        <w:spacing w:after="60" w:before="0"/>
-        <w:ind w:left="283"/>
-        <w:jc w:val="left"/>
-      </w:pPr>
-      <w:r>
-        <w:rPr>
-          <w:rFonts w:ascii="Times New Roman" w:hAnsi="Times New Roman" w:eastAsia="Times New Roman" w:cs="Times New Roman"/>
-          <w:b w:val="0"/>
-          <w:i w:val="0"/>
-          <w:sz w:val="24"/>
-        </w:rPr>
-        <w:t>1) обзор методов классификации изображений и обоснование выбора архитектуры нейронной сети;</w:t>
-      </w:r>
-    </w:p>
-    <w:p>
-      <w:pPr>
-        <w:spacing w:after="60" w:before="0"/>
-        <w:ind w:left="283"/>
-        <w:jc w:val="left"/>
-      </w:pPr>
-      <w:r>
-        <w:rPr>
-          <w:rFonts w:ascii="Times New Roman" w:hAnsi="Times New Roman" w:eastAsia="Times New Roman" w:cs="Times New Roman"/>
-          <w:b w:val="0"/>
-          <w:i w:val="0"/>
-          <w:sz w:val="24"/>
-        </w:rPr>
-        <w:t>2) сбор, разметка, предобработка и балансировка датасета фотографий по стилевым категориям;</w:t>
-      </w:r>
-    </w:p>
-    <w:p>
-      <w:pPr>
-        <w:spacing w:after="60" w:before="0"/>
-        <w:ind w:left="283"/>
-        <w:jc w:val="left"/>
-      </w:pPr>
-      <w:r>
-        <w:rPr>
-          <w:rFonts w:ascii="Times New Roman" w:hAnsi="Times New Roman" w:eastAsia="Times New Roman" w:cs="Times New Roman"/>
-          <w:b w:val="0"/>
-          <w:i w:val="0"/>
-          <w:sz w:val="24"/>
-        </w:rPr>
-        <w:t>3) обучение модели классификации методом transfer learning, оценка качества на отложенной выборке;</w:t>
-      </w:r>
-    </w:p>
-    <w:p>
-      <w:pPr>
-        <w:spacing w:after="60" w:before="0"/>
-        <w:ind w:left="283"/>
-        <w:jc w:val="left"/>
-      </w:pPr>
-      <w:r>
-        <w:rPr>
-          <w:rFonts w:ascii="Times New Roman" w:hAnsi="Times New Roman" w:eastAsia="Times New Roman" w:cs="Times New Roman"/>
-          <w:b w:val="0"/>
-          <w:i w:val="0"/>
-          <w:sz w:val="24"/>
-        </w:rPr>
-        <w:t>4) проектирование микросервисной архитектуры системы;</w:t>
-      </w:r>
-    </w:p>
-    <w:p>
-      <w:pPr>
-        <w:spacing w:after="60" w:before="0"/>
-        <w:ind w:left="283"/>
-        <w:jc w:val="left"/>
-      </w:pPr>
-      <w:r>
-        <w:rPr>
-          <w:rFonts w:ascii="Times New Roman" w:hAnsi="Times New Roman" w:eastAsia="Times New Roman" w:cs="Times New Roman"/>
-          <w:b w:val="0"/>
-          <w:i w:val="0"/>
-          <w:sz w:val="24"/>
-        </w:rPr>
-        <w:t>5) реализация серверной части, ML-сервиса и клиентского веб-приложения;</w:t>
-      </w:r>
-    </w:p>
-    <w:p>
-      <w:pPr>
-        <w:spacing w:after="60" w:before="0"/>
-        <w:ind w:left="283"/>
-        <w:jc w:val="left"/>
-      </w:pPr>
-      <w:r>
-        <w:rPr>
-          <w:rFonts w:ascii="Times New Roman" w:hAnsi="Times New Roman" w:eastAsia="Times New Roman" w:cs="Times New Roman"/>
-          <w:b w:val="0"/>
-          <w:i w:val="0"/>
-          <w:sz w:val="24"/>
-        </w:rPr>
-        <w:t>6) проведение исследовательских экспериментов (интерпретируемость, качество представлений, сравнение с альтернативными моделями, калибровка, multi-label);</w:t>
-      </w:r>
-    </w:p>
-    <w:p>
-      <w:pPr>
-        <w:spacing w:after="60" w:before="0"/>
-        <w:ind w:left="283"/>
-        <w:jc w:val="left"/>
-      </w:pPr>
-      <w:r>
-        <w:rPr>
-          <w:rFonts w:ascii="Times New Roman" w:hAnsi="Times New Roman" w:eastAsia="Times New Roman" w:cs="Times New Roman"/>
-          <w:b w:val="0"/>
-          <w:i w:val="0"/>
-          <w:sz w:val="24"/>
-        </w:rPr>
-        <w:t>7) развёртывание, тестирование и анализ результатов работы системы.</w:t>
-      </w:r>
-    </w:p>
-    <w:p/>
-    <w:p>
-      <w:pPr>
-        <w:spacing w:after="80" w:before="0"/>
-        <w:jc w:val="left"/>
-      </w:pPr>
-      <w:r>
-        <w:rPr>
-          <w:rFonts w:ascii="Times New Roman" w:hAnsi="Times New Roman" w:eastAsia="Times New Roman" w:cs="Times New Roman"/>
-          <w:b/>
-          <w:i w:val="0"/>
-          <w:sz w:val="24"/>
-        </w:rPr>
-        <w:t>5. Перечень графического (иллюстративного) материала:</w:t>
-      </w:r>
-    </w:p>
-    <w:p>
-      <w:pPr>
-        <w:spacing w:after="60" w:before="0"/>
-        <w:ind w:left="283"/>
-        <w:jc w:val="left"/>
-      </w:pPr>
-      <w:r>
-        <w:rPr>
-          <w:rFonts w:ascii="Times New Roman" w:hAnsi="Times New Roman" w:eastAsia="Times New Roman" w:cs="Times New Roman"/>
-          <w:b w:val="0"/>
-          <w:i w:val="0"/>
-          <w:sz w:val="24"/>
-        </w:rPr>
-        <w:t>– схема микросервисной архитектуры системы и диаграмма потока данных;</w:t>
-      </w:r>
-    </w:p>
-    <w:p>
-      <w:pPr>
-        <w:spacing w:after="60" w:before="0"/>
-        <w:ind w:left="283"/>
-        <w:jc w:val="left"/>
-      </w:pPr>
-      <w:r>
-        <w:rPr>
-          <w:rFonts w:ascii="Times New Roman" w:hAnsi="Times New Roman" w:eastAsia="Times New Roman" w:cs="Times New Roman"/>
-          <w:b w:val="0"/>
-          <w:i w:val="0"/>
-          <w:sz w:val="24"/>
-        </w:rPr>
-        <w:t>– таблицы метрик качества модели, матрицы ошибок (confusion matrix);</w:t>
-      </w:r>
-    </w:p>
-    <w:p>
-      <w:pPr>
-        <w:spacing w:after="60" w:before="0"/>
-        <w:ind w:left="283"/>
-        <w:jc w:val="left"/>
-      </w:pPr>
-      <w:r>
-        <w:rPr>
-          <w:rFonts w:ascii="Times New Roman" w:hAnsi="Times New Roman" w:eastAsia="Times New Roman" w:cs="Times New Roman"/>
-          <w:b w:val="0"/>
-          <w:i w:val="0"/>
-          <w:sz w:val="24"/>
-        </w:rPr>
-        <w:t>– графики процесса обучения и визуализации экспериментов (Grad-CAM, t-SNE, диаграммы калибровки);</w:t>
-      </w:r>
-    </w:p>
-    <w:p>
-      <w:pPr>
-        <w:spacing w:after="60" w:before="0"/>
-        <w:ind w:left="283"/>
-        <w:jc w:val="left"/>
-      </w:pPr>
-      <w:r>
-        <w:rPr>
-          <w:rFonts w:ascii="Times New Roman" w:hAnsi="Times New Roman" w:eastAsia="Times New Roman" w:cs="Times New Roman"/>
-          <w:b w:val="0"/>
-          <w:i w:val="0"/>
-          <w:sz w:val="24"/>
-        </w:rPr>
-        <w:t>– скриншоты пользовательского интерфейса.</w:t>
-      </w:r>
-    </w:p>
-    <w:p/>
-    <w:p>
-      <w:pPr>
-        <w:spacing w:after="80"/>
-      </w:pPr>
-      <w:r>
-        <w:rPr>
-          <w:rFonts w:ascii="Times New Roman" w:hAnsi="Times New Roman" w:eastAsia="Times New Roman" w:cs="Times New Roman"/>
-          <w:b w:val="0"/>
-          <w:i w:val="0"/>
-          <w:sz w:val="24"/>
-        </w:rPr>
-        <w:t xml:space="preserve">6. Дата выдачи задания: </w:t>
-      </w:r>
-      <w:r>
-        <w:rPr>
-          <w:rFonts w:ascii="Times New Roman" w:hAnsi="Times New Roman" w:eastAsia="Times New Roman" w:cs="Times New Roman"/>
-          <w:b/>
-          <w:i w:val="0"/>
-          <w:sz w:val="24"/>
-        </w:rPr>
-        <w:t>27 апреля 2026 г.</w:t>
-      </w:r>
-    </w:p>
-    <w:p/>
-    <w:p/>
-    <w:p>
-      <w:pPr>
-        <w:spacing w:after="280" w:before="0"/>
-        <w:jc w:val="left"/>
-      </w:pPr>
-      <w:r>
-        <w:rPr>
-          <w:rFonts w:ascii="Times New Roman" w:hAnsi="Times New Roman" w:eastAsia="Times New Roman" w:cs="Times New Roman"/>
-          <w:b w:val="0"/>
-          <w:i w:val="0"/>
-          <w:sz w:val="24"/>
-        </w:rPr>
-        <w:t>Руководитель ВКР: ____________________ / Чалый Дмитрий Юрьевич, к.п.н., доцент /</w:t>
-      </w:r>
-    </w:p>
-    <w:p>
-      <w:pPr>
-        <w:spacing w:after="280" w:before="0"/>
-        <w:jc w:val="left"/>
-      </w:pPr>
-      <w:r>
-        <w:rPr>
-          <w:rFonts w:ascii="Times New Roman" w:hAnsi="Times New Roman" w:eastAsia="Times New Roman" w:cs="Times New Roman"/>
-          <w:b w:val="0"/>
-          <w:i w:val="0"/>
-          <w:sz w:val="24"/>
-        </w:rPr>
-        <w:t>Задание принял к исполнению: ____________________ / Журавлев Тарас Русланович /</w:t>
-      </w:r>
-    </w:p>
-    <w:p>
-      <w:pPr>
-        <w:spacing w:after="80" w:before="0"/>
-        <w:jc w:val="left"/>
-      </w:pPr>
-      <w:r>
-        <w:rPr>
-          <w:rFonts w:ascii="Times New Roman" w:hAnsi="Times New Roman" w:eastAsia="Times New Roman" w:cs="Times New Roman"/>
-          <w:b w:val="0"/>
-          <w:i w:val="0"/>
-          <w:sz w:val="24"/>
-        </w:rPr>
-        <w:t>«___» __________ 2026 г.</w:t>
+        <w:t>«14» апреля 2026 г.</w:t>
       </w:r>
     </w:p>
     <w:sectPr>
       <w:pgSz w:w="12240" w:h="15840"/>
-      <w:pgMar w:top="1134" w:right="850" w:bottom="1134" w:left="1701" w:header="720" w:footer="720" w:gutter="0"/>
+      <w:pgMar w:top="850" w:right="850" w:bottom="850" w:left="1701" w:header="720" w:footer="720" w:gutter="0"/>
       <w:cols w:space="720"/>
       <w:docGrid w:linePitch="360"/>
     </w:sectPr>

</xml_diff>